<commit_message>
final changes to word doc
</commit_message>
<xml_diff>
--- a/CrimeDrug_Cell-DEVS.docx
+++ b/CrimeDrug_Cell-DEVS.docx
@@ -378,63 +378,6 @@
           <w:r>
             <w:fldChar w:fldCharType="separate"/>
           </w:r>
-          <w:hyperlink w:anchor="_Toc225340462" w:history="1">
-            <w:r>
-              <w:rPr>
-                <w:rStyle w:val="Hyperlink"/>
-                <w:noProof/>
-              </w:rPr>
-              <w:t>Table of Contents</w:t>
-            </w:r>
-            <w:r>
-              <w:rPr>
-                <w:noProof/>
-                <w:webHidden/>
-              </w:rPr>
-              <w:tab/>
-            </w:r>
-            <w:r>
-              <w:rPr>
-                <w:noProof/>
-                <w:webHidden/>
-              </w:rPr>
-              <w:fldChar w:fldCharType="begin"/>
-            </w:r>
-            <w:r>
-              <w:rPr>
-                <w:noProof/>
-                <w:webHidden/>
-              </w:rPr>
-              <w:instrText xml:space="preserve"> PAGEREF _Toc225340462 \h </w:instrText>
-            </w:r>
-            <w:r>
-              <w:rPr>
-                <w:noProof/>
-                <w:webHidden/>
-              </w:rPr>
-            </w:r>
-            <w:r>
-              <w:rPr>
-                <w:noProof/>
-                <w:webHidden/>
-              </w:rPr>
-              <w:fldChar w:fldCharType="separate"/>
-            </w:r>
-            <w:r>
-              <w:rPr>
-                <w:noProof/>
-                <w:webHidden/>
-              </w:rPr>
-              <w:t>2</w:t>
-            </w:r>
-            <w:r>
-              <w:rPr>
-                <w:noProof/>
-                <w:webHidden/>
-              </w:rPr>
-              <w:fldChar w:fldCharType="end"/>
-            </w:r>
-          </w:hyperlink>
         </w:p>
         <w:p>
           <w:pPr>
@@ -1001,7 +944,7 @@
                 <w:noProof/>
                 <w:webHidden/>
               </w:rPr>
-              <w:t>9</w:t>
+              <w:t>8</w:t>
             </w:r>
             <w:r>
               <w:rPr>
@@ -1073,7 +1016,7 @@
                 <w:noProof/>
                 <w:webHidden/>
               </w:rPr>
-              <w:t>10</w:t>
+              <w:t>9</w:t>
             </w:r>
             <w:r>
               <w:rPr>
@@ -1145,7 +1088,7 @@
                 <w:noProof/>
                 <w:webHidden/>
               </w:rPr>
-              <w:t>10</w:t>
+              <w:t>9</w:t>
             </w:r>
             <w:r>
               <w:rPr>
@@ -1217,7 +1160,7 @@
                 <w:noProof/>
                 <w:webHidden/>
               </w:rPr>
-              <w:t>10</w:t>
+              <w:t>9</w:t>
             </w:r>
             <w:r>
               <w:rPr>
@@ -1289,7 +1232,7 @@
                 <w:noProof/>
                 <w:webHidden/>
               </w:rPr>
-              <w:t>10</w:t>
+              <w:t>9</w:t>
             </w:r>
             <w:r>
               <w:rPr>
@@ -1361,7 +1304,7 @@
                 <w:noProof/>
                 <w:webHidden/>
               </w:rPr>
-              <w:t>11</w:t>
+              <w:t>10</w:t>
             </w:r>
             <w:r>
               <w:rPr>
@@ -1433,7 +1376,7 @@
                 <w:noProof/>
                 <w:webHidden/>
               </w:rPr>
-              <w:t>12</w:t>
+              <w:t>11</w:t>
             </w:r>
             <w:r>
               <w:rPr>
@@ -1649,25 +1592,117 @@
         <w:spacing w:line="360" w:lineRule="auto"/>
       </w:pPr>
       <w:r>
-        <w:t>Atomic Cell-DEVS = TDC = IDC = &lt; X , Y , I , S , θ , N , d , δ</w:t>
-      </w:r>
+        <w:t xml:space="preserve">Atomic Cell-DEVS = TDC = IDC = &lt; </w:t>
+      </w:r>
+      <w:proofErr w:type="gramStart"/>
+      <w:r>
+        <w:t>X ,</w:t>
+      </w:r>
+      <w:proofErr w:type="gramEnd"/>
+      <w:r>
+        <w:t xml:space="preserve"> </w:t>
+      </w:r>
+      <w:proofErr w:type="gramStart"/>
+      <w:r>
+        <w:t>Y ,</w:t>
+      </w:r>
+      <w:proofErr w:type="gramEnd"/>
+      <w:r>
+        <w:t xml:space="preserve"> </w:t>
+      </w:r>
+      <w:proofErr w:type="gramStart"/>
+      <w:r>
+        <w:t>I ,</w:t>
+      </w:r>
+      <w:proofErr w:type="gramEnd"/>
+      <w:r>
+        <w:t xml:space="preserve"> </w:t>
+      </w:r>
+      <w:proofErr w:type="gramStart"/>
+      <w:r>
+        <w:t>S ,</w:t>
+      </w:r>
+      <w:proofErr w:type="gramEnd"/>
+      <w:r>
+        <w:t xml:space="preserve"> </w:t>
+      </w:r>
+      <w:proofErr w:type="gramStart"/>
+      <w:r>
+        <w:t>θ ,</w:t>
+      </w:r>
+      <w:proofErr w:type="gramEnd"/>
+      <w:r>
+        <w:t xml:space="preserve"> </w:t>
+      </w:r>
+      <w:proofErr w:type="gramStart"/>
+      <w:r>
+        <w:t>N ,</w:t>
+      </w:r>
+      <w:proofErr w:type="gramEnd"/>
+      <w:r>
+        <w:t xml:space="preserve"> </w:t>
+      </w:r>
+      <w:proofErr w:type="gramStart"/>
+      <w:r>
+        <w:t>d ,</w:t>
+      </w:r>
+      <w:proofErr w:type="gramEnd"/>
+      <w:r>
+        <w:t xml:space="preserve"> </w:t>
+      </w:r>
+      <w:proofErr w:type="spellStart"/>
+      <w:r>
+        <w:t>δ</w:t>
+      </w:r>
+      <w:proofErr w:type="gramStart"/>
       <w:r>
         <w:rPr>
           <w:vertAlign w:val="subscript"/>
         </w:rPr>
         <w:t>int</w:t>
       </w:r>
-      <w:r>
-        <w:t xml:space="preserve"> , δ</w:t>
-      </w:r>
+      <w:proofErr w:type="spellEnd"/>
+      <w:r>
+        <w:t xml:space="preserve"> ,</w:t>
+      </w:r>
+      <w:proofErr w:type="gramEnd"/>
+      <w:r>
+        <w:t xml:space="preserve"> </w:t>
+      </w:r>
+      <w:proofErr w:type="spellStart"/>
+      <w:r>
+        <w:t>δ</w:t>
+      </w:r>
+      <w:proofErr w:type="gramStart"/>
       <w:r>
         <w:rPr>
           <w:vertAlign w:val="subscript"/>
         </w:rPr>
         <w:t>ext</w:t>
       </w:r>
-      <w:r>
-        <w:t xml:space="preserve"> , τ , λ , D &gt;</w:t>
+      <w:proofErr w:type="spellEnd"/>
+      <w:r>
+        <w:t xml:space="preserve"> ,</w:t>
+      </w:r>
+      <w:proofErr w:type="gramEnd"/>
+      <w:r>
+        <w:t xml:space="preserve"> </w:t>
+      </w:r>
+      <w:proofErr w:type="gramStart"/>
+      <w:r>
+        <w:t>τ ,</w:t>
+      </w:r>
+      <w:proofErr w:type="gramEnd"/>
+      <w:r>
+        <w:t xml:space="preserve"> </w:t>
+      </w:r>
+      <w:proofErr w:type="gramStart"/>
+      <w:r>
+        <w:t>λ ,</w:t>
+      </w:r>
+      <w:proofErr w:type="gramEnd"/>
+      <w:r>
+        <w:t xml:space="preserve"> D &gt;</w:t>
       </w:r>
     </w:p>
     <w:p>
@@ -1721,7 +1756,21 @@
         <w:rPr>
           <w:rFonts w:eastAsia="Gungsuh"/>
         </w:rPr>
-        <w:t xml:space="preserve"> T : set of output external events</w:t>
+        <w:t xml:space="preserve"> </w:t>
+      </w:r>
+      <w:proofErr w:type="gramStart"/>
+      <w:r>
+        <w:rPr>
+          <w:rFonts w:eastAsia="Gungsuh"/>
+        </w:rPr>
+        <w:t>T :</w:t>
+      </w:r>
+      <w:proofErr w:type="gramEnd"/>
+      <w:r>
+        <w:rPr>
+          <w:rFonts w:eastAsia="Gungsuh"/>
+        </w:rPr>
+        <w:t xml:space="preserve"> set of output external events</w:t>
       </w:r>
     </w:p>
     <w:p>
@@ -1733,7 +1782,23 @@
         <w:spacing w:line="360" w:lineRule="auto"/>
       </w:pPr>
       <w:r>
-        <w:t>I = &lt; η, μ, Px, Py &gt; : model’s modular interface</w:t>
+        <w:t xml:space="preserve">I = &lt; η, μ, </w:t>
+      </w:r>
+      <w:proofErr w:type="spellStart"/>
+      <w:r>
+        <w:t>Px</w:t>
+      </w:r>
+      <w:proofErr w:type="spellEnd"/>
+      <w:r>
+        <w:t xml:space="preserve">, Py </w:t>
+      </w:r>
+      <w:proofErr w:type="gramStart"/>
+      <w:r>
+        <w:t>&gt; :</w:t>
+      </w:r>
+      <w:proofErr w:type="gramEnd"/>
+      <w:r>
+        <w:t xml:space="preserve"> model’s modular interface</w:t>
       </w:r>
     </w:p>
     <w:p>
@@ -1745,7 +1810,23 @@
         <w:spacing w:line="360" w:lineRule="auto"/>
       </w:pPr>
       <w:r>
-        <w:t>η member of N, η &lt; infinity : the neighborhood size,</w:t>
+        <w:t xml:space="preserve">η member of N, η &lt; </w:t>
+      </w:r>
+      <w:proofErr w:type="gramStart"/>
+      <w:r>
+        <w:t>infinity :</w:t>
+      </w:r>
+      <w:proofErr w:type="gramEnd"/>
+      <w:r>
+        <w:t xml:space="preserve"> the </w:t>
+      </w:r>
+      <w:proofErr w:type="spellStart"/>
+      <w:r>
+        <w:t>neighborhood</w:t>
+      </w:r>
+      <w:proofErr w:type="spellEnd"/>
+      <w:r>
+        <w:t xml:space="preserve"> size,</w:t>
       </w:r>
     </w:p>
     <w:p>
@@ -1757,8 +1838,21 @@
         <w:spacing w:line="360" w:lineRule="auto"/>
       </w:pPr>
       <w:r>
-        <w:t>μ member of N, μ &lt; infinity : the number of other input-output ports not in the neighborhood</w:t>
-      </w:r>
+        <w:t xml:space="preserve">μ member of N, μ &lt; </w:t>
+      </w:r>
+      <w:proofErr w:type="gramStart"/>
+      <w:r>
+        <w:t>infinity :</w:t>
+      </w:r>
+      <w:proofErr w:type="gramEnd"/>
+      <w:r>
+        <w:t xml:space="preserve"> the number of other input-output ports not in the </w:t>
+      </w:r>
+      <w:proofErr w:type="spellStart"/>
+      <w:r>
+        <w:t>neighborhood</w:t>
+      </w:r>
+      <w:proofErr w:type="spellEnd"/>
     </w:p>
     <w:p>
       <w:pPr>
@@ -1784,7 +1878,21 @@
         <w:rPr>
           <w:rFonts w:eastAsia="Gungsuh"/>
         </w:rPr>
-        <w:t xml:space="preserve"> T : set of possible sequential states for a given cell</w:t>
+        <w:t xml:space="preserve"> </w:t>
+      </w:r>
+      <w:proofErr w:type="gramStart"/>
+      <w:r>
+        <w:rPr>
+          <w:rFonts w:eastAsia="Gungsuh"/>
+        </w:rPr>
+        <w:t>T :</w:t>
+      </w:r>
+      <w:proofErr w:type="gramEnd"/>
+      <w:r>
+        <w:rPr>
+          <w:rFonts w:eastAsia="Gungsuh"/>
+        </w:rPr>
+        <w:t xml:space="preserve"> set of possible sequential states for a given cell</w:t>
       </w:r>
     </w:p>
     <w:p>
@@ -1811,16 +1919,41 @@
         <w:rPr>
           <w:rFonts w:eastAsia="Gungsuh"/>
         </w:rPr>
-        <w:t xml:space="preserve"> S</w:t>
+        <w:t xml:space="preserve"> </w:t>
+      </w:r>
+      <w:proofErr w:type="spellStart"/>
+      <w:r>
+        <w:rPr>
+          <w:rFonts w:eastAsia="Gungsuh"/>
+        </w:rPr>
+        <w:t>S</w:t>
       </w:r>
       <w:r>
         <w:rPr>
           <w:vertAlign w:val="superscript"/>
         </w:rPr>
-        <w:t>η + μ</w:t>
-      </w:r>
-      <w:r>
-        <w:t xml:space="preserve"> :  the set of the stored input events (states)</w:t>
+        <w:t>η</w:t>
+      </w:r>
+      <w:proofErr w:type="spellEnd"/>
+      <w:r>
+        <w:rPr>
+          <w:vertAlign w:val="superscript"/>
+        </w:rPr>
+        <w:t xml:space="preserve"> + </w:t>
+      </w:r>
+      <w:proofErr w:type="gramStart"/>
+      <w:r>
+        <w:rPr>
+          <w:vertAlign w:val="superscript"/>
+        </w:rPr>
+        <w:t>μ</w:t>
+      </w:r>
+      <w:r>
+        <w:t xml:space="preserve"> :</w:t>
+      </w:r>
+      <w:proofErr w:type="gramEnd"/>
+      <w:r>
+        <w:t xml:space="preserve">  the set of the stored input events (states)</w:t>
       </w:r>
     </w:p>
     <w:p>
@@ -1831,8 +1964,13 @@
         </w:numPr>
         <w:spacing w:line="360" w:lineRule="auto"/>
       </w:pPr>
-      <w:r>
-        <w:t>θ : the definition of the cell’s state variables</w:t>
+      <w:proofErr w:type="gramStart"/>
+      <w:r>
+        <w:t>θ :</w:t>
+      </w:r>
+      <w:proofErr w:type="gramEnd"/>
+      <w:r>
+        <w:t xml:space="preserve"> the definition of the cell’s state variables</w:t>
       </w:r>
     </w:p>
     <w:p>
@@ -1843,6 +1981,7 @@
         </w:numPr>
         <w:spacing w:line="360" w:lineRule="auto"/>
       </w:pPr>
+      <w:proofErr w:type="spellStart"/>
       <w:r>
         <w:t>δ</w:t>
       </w:r>
@@ -1852,6 +1991,7 @@
         </w:rPr>
         <w:t>int</w:t>
       </w:r>
+      <w:proofErr w:type="spellEnd"/>
       <w:r>
         <w:t>: internal transition function</w:t>
       </w:r>
@@ -1864,17 +2004,24 @@
         </w:numPr>
         <w:spacing w:line="360" w:lineRule="auto"/>
       </w:pPr>
+      <w:proofErr w:type="spellStart"/>
       <w:r>
         <w:t>δ</w:t>
       </w:r>
+      <w:proofErr w:type="gramStart"/>
       <w:r>
         <w:rPr>
           <w:vertAlign w:val="subscript"/>
         </w:rPr>
         <w:t>ext</w:t>
       </w:r>
-      <w:r>
-        <w:t xml:space="preserve"> : external transition function</w:t>
+      <w:proofErr w:type="spellEnd"/>
+      <w:r>
+        <w:t xml:space="preserve"> :</w:t>
+      </w:r>
+      <w:proofErr w:type="gramEnd"/>
+      <w:r>
+        <w:t xml:space="preserve"> external transition function</w:t>
       </w:r>
     </w:p>
     <w:p>
@@ -1885,8 +2032,13 @@
         </w:numPr>
         <w:spacing w:line="360" w:lineRule="auto"/>
       </w:pPr>
-      <w:r>
-        <w:t>τ : local computing function</w:t>
+      <w:proofErr w:type="gramStart"/>
+      <w:r>
+        <w:t>τ :</w:t>
+      </w:r>
+      <w:proofErr w:type="gramEnd"/>
+      <w:r>
+        <w:t xml:space="preserve"> local computing function</w:t>
       </w:r>
     </w:p>
     <w:p>
@@ -1897,8 +2049,13 @@
         </w:numPr>
         <w:spacing w:line="360" w:lineRule="auto"/>
       </w:pPr>
-      <w:r>
-        <w:t>λ : output function</w:t>
+      <w:proofErr w:type="gramStart"/>
+      <w:r>
+        <w:t>λ :</w:t>
+      </w:r>
+      <w:proofErr w:type="gramEnd"/>
+      <w:r>
+        <w:t xml:space="preserve"> output function</w:t>
       </w:r>
     </w:p>
     <w:p>
@@ -1909,9 +2066,19 @@
         </w:numPr>
         <w:spacing w:line="360" w:lineRule="auto"/>
       </w:pPr>
-      <w:r>
-        <w:t>D : θ x N x d  R</w:t>
-      </w:r>
+      <w:proofErr w:type="gramStart"/>
+      <w:r>
+        <w:t>D :</w:t>
+      </w:r>
+      <w:proofErr w:type="gramEnd"/>
+      <w:r>
+        <w:t xml:space="preserve"> θ x N x </w:t>
+      </w:r>
+      <w:proofErr w:type="gramStart"/>
+      <w:r>
+        <w:t>d  R</w:t>
+      </w:r>
+      <w:proofErr w:type="gramEnd"/>
       <w:r>
         <w:rPr>
           <w:vertAlign w:val="subscript"/>
@@ -1993,13 +2160,29 @@
         <w:spacing w:before="240" w:after="240"/>
       </w:pPr>
       <w:r>
-        <w:t xml:space="preserve">I = &lt; η, μ, Px, Py &gt; with η = </w:t>
+        <w:t xml:space="preserve">I = &lt; η, μ, </w:t>
+      </w:r>
+      <w:proofErr w:type="spellStart"/>
+      <w:r>
+        <w:t>Px</w:t>
+      </w:r>
+      <w:proofErr w:type="spellEnd"/>
+      <w:r>
+        <w:t xml:space="preserve">, Py &gt; with η = </w:t>
       </w:r>
       <w:r>
         <w:t>8</w:t>
       </w:r>
       <w:r>
-        <w:t>, μ = 0, Px = {Ø}, Py = {Ø}</w:t>
+        <w:t xml:space="preserve">, μ = 0, </w:t>
+      </w:r>
+      <w:proofErr w:type="spellStart"/>
+      <w:r>
+        <w:t>Px</w:t>
+      </w:r>
+      <w:proofErr w:type="spellEnd"/>
+      <w:r>
+        <w:t xml:space="preserve"> = {Ø}, Py = {Ø}</w:t>
       </w:r>
     </w:p>
     <w:p>
@@ -2024,12 +2207,56 @@
         </w:rPr>
         <w:t xml:space="preserve">N = </w:t>
       </w:r>
-      <w:r>
-        <w:rPr>
-          <w:rFonts w:eastAsia="Gungsuh"/>
-        </w:rPr>
-        <w:t>{ (−2,0), (−1,0), (1,0), (2,0), (0,−2), (0,−1), (0,1), (0,2) }</w:t>
-      </w:r>
+      <w:proofErr w:type="gramStart"/>
+      <w:r>
+        <w:rPr>
+          <w:rFonts w:eastAsia="Gungsuh"/>
+        </w:rPr>
+        <w:t>{ (</w:t>
+      </w:r>
+      <w:proofErr w:type="gramEnd"/>
+      <w:r>
+        <w:rPr>
+          <w:rFonts w:eastAsia="Gungsuh"/>
+        </w:rPr>
+        <w:t>−2,0), (−1,0), (1,0), (2,0), (</w:t>
+      </w:r>
+      <w:proofErr w:type="gramStart"/>
+      <w:r>
+        <w:rPr>
+          <w:rFonts w:eastAsia="Gungsuh"/>
+        </w:rPr>
+        <w:t>0,−</w:t>
+      </w:r>
+      <w:proofErr w:type="gramEnd"/>
+      <w:r>
+        <w:rPr>
+          <w:rFonts w:eastAsia="Gungsuh"/>
+        </w:rPr>
+        <w:t>2), (</w:t>
+      </w:r>
+      <w:proofErr w:type="gramStart"/>
+      <w:r>
+        <w:rPr>
+          <w:rFonts w:eastAsia="Gungsuh"/>
+        </w:rPr>
+        <w:t>0,−</w:t>
+      </w:r>
+      <w:proofErr w:type="gramEnd"/>
+      <w:r>
+        <w:rPr>
+          <w:rFonts w:eastAsia="Gungsuh"/>
+        </w:rPr>
+        <w:t>1), (0,1), (0,2</w:t>
+      </w:r>
+      <w:proofErr w:type="gramStart"/>
+      <w:r>
+        <w:rPr>
+          <w:rFonts w:eastAsia="Gungsuh"/>
+        </w:rPr>
+        <w:t>) }</w:t>
+      </w:r>
+      <w:proofErr w:type="gramEnd"/>
     </w:p>
     <w:p>
       <w:pPr>
@@ -2059,7 +2286,23 @@
         <w:spacing w:before="240" w:after="240"/>
       </w:pPr>
       <w:r>
-        <w:t>Component δint, δext, λ, D:</w:t>
+        <w:t xml:space="preserve">Component </w:t>
+      </w:r>
+      <w:proofErr w:type="spellStart"/>
+      <w:r>
+        <w:t>δint</w:t>
+      </w:r>
+      <w:proofErr w:type="spellEnd"/>
+      <w:r>
+        <w:t xml:space="preserve">, </w:t>
+      </w:r>
+      <w:proofErr w:type="spellStart"/>
+      <w:r>
+        <w:t>δext</w:t>
+      </w:r>
+      <w:proofErr w:type="spellEnd"/>
+      <w:r>
+        <w:t>, λ, D:</w:t>
       </w:r>
     </w:p>
     <w:p>
@@ -2094,8 +2337,72 @@
         <w:rPr>
           <w:lang w:val="fr-FR"/>
         </w:rPr>
-        <w:t xml:space="preserve"> — Zone: nondrugtodrug-transition { (0,0)..(19,19) }</w:t>
-      </w:r>
+        <w:t xml:space="preserve"> — </w:t>
+      </w:r>
+      <w:proofErr w:type="gramStart"/>
+      <w:r>
+        <w:rPr>
+          <w:lang w:val="fr-FR"/>
+        </w:rPr>
+        <w:t>Zone:</w:t>
+      </w:r>
+      <w:proofErr w:type="gramEnd"/>
+      <w:r>
+        <w:rPr>
+          <w:lang w:val="fr-FR"/>
+        </w:rPr>
+        <w:t xml:space="preserve"> </w:t>
+      </w:r>
+      <w:proofErr w:type="spellStart"/>
+      <w:r>
+        <w:rPr>
+          <w:lang w:val="fr-FR"/>
+        </w:rPr>
+        <w:t>nondrugtodrug</w:t>
+      </w:r>
+      <w:proofErr w:type="spellEnd"/>
+      <w:r>
+        <w:rPr>
+          <w:lang w:val="fr-FR"/>
+        </w:rPr>
+        <w:t xml:space="preserve">-transition </w:t>
+      </w:r>
+      <w:proofErr w:type="gramStart"/>
+      <w:r>
+        <w:rPr>
+          <w:lang w:val="fr-FR"/>
+        </w:rPr>
+        <w:t>{ (</w:t>
+      </w:r>
+      <w:proofErr w:type="gramEnd"/>
+      <w:r>
+        <w:rPr>
+          <w:lang w:val="fr-FR"/>
+        </w:rPr>
+        <w:t>0,0</w:t>
+      </w:r>
+      <w:proofErr w:type="gramStart"/>
+      <w:r>
+        <w:rPr>
+          <w:lang w:val="fr-FR"/>
+        </w:rPr>
+        <w:t>)..</w:t>
+      </w:r>
+      <w:proofErr w:type="gramEnd"/>
+      <w:r>
+        <w:rPr>
+          <w:lang w:val="fr-FR"/>
+        </w:rPr>
+        <w:t>(19,19</w:t>
+      </w:r>
+      <w:proofErr w:type="gramStart"/>
+      <w:r>
+        <w:rPr>
+          <w:lang w:val="fr-FR"/>
+        </w:rPr>
+        <w:t>) }</w:t>
+      </w:r>
+      <w:proofErr w:type="gramEnd"/>
     </w:p>
     <w:p>
       <w:pPr>
@@ -2111,11 +2418,89 @@
         </w:rPr>
         <w:t xml:space="preserve">Rule 1: </w:t>
       </w:r>
-      <w:r>
-        <w:rPr>
-          <w:rFonts w:eastAsia="Gungsuh"/>
-        </w:rPr>
-        <w:t>lrp = 1  if lrp = 0  AND  2+ immediate neighbours have lrp = 1 AND  uniform(0, 1) &lt; 0.70</w:t>
+      <w:proofErr w:type="spellStart"/>
+      <w:r>
+        <w:rPr>
+          <w:rFonts w:eastAsia="Gungsuh"/>
+        </w:rPr>
+        <w:t>lrp</w:t>
+      </w:r>
+      <w:proofErr w:type="spellEnd"/>
+      <w:r>
+        <w:rPr>
+          <w:rFonts w:eastAsia="Gungsuh"/>
+        </w:rPr>
+        <w:t xml:space="preserve"> = </w:t>
+      </w:r>
+      <w:proofErr w:type="gramStart"/>
+      <w:r>
+        <w:rPr>
+          <w:rFonts w:eastAsia="Gungsuh"/>
+        </w:rPr>
+        <w:t>1  if</w:t>
+      </w:r>
+      <w:proofErr w:type="gramEnd"/>
+      <w:r>
+        <w:rPr>
+          <w:rFonts w:eastAsia="Gungsuh"/>
+        </w:rPr>
+        <w:t xml:space="preserve"> </w:t>
+      </w:r>
+      <w:proofErr w:type="spellStart"/>
+      <w:r>
+        <w:rPr>
+          <w:rFonts w:eastAsia="Gungsuh"/>
+        </w:rPr>
+        <w:t>lrp</w:t>
+      </w:r>
+      <w:proofErr w:type="spellEnd"/>
+      <w:r>
+        <w:rPr>
+          <w:rFonts w:eastAsia="Gungsuh"/>
+        </w:rPr>
+        <w:t xml:space="preserve"> = </w:t>
+      </w:r>
+      <w:proofErr w:type="gramStart"/>
+      <w:r>
+        <w:rPr>
+          <w:rFonts w:eastAsia="Gungsuh"/>
+        </w:rPr>
+        <w:t>0  AND</w:t>
+      </w:r>
+      <w:proofErr w:type="gramEnd"/>
+      <w:r>
+        <w:rPr>
+          <w:rFonts w:eastAsia="Gungsuh"/>
+        </w:rPr>
+        <w:t xml:space="preserve">  2+ immediate neighbours have </w:t>
+      </w:r>
+      <w:proofErr w:type="spellStart"/>
+      <w:r>
+        <w:rPr>
+          <w:rFonts w:eastAsia="Gungsuh"/>
+        </w:rPr>
+        <w:t>lrp</w:t>
+      </w:r>
+      <w:proofErr w:type="spellEnd"/>
+      <w:r>
+        <w:rPr>
+          <w:rFonts w:eastAsia="Gungsuh"/>
+        </w:rPr>
+        <w:t xml:space="preserve"> = 1 </w:t>
+      </w:r>
+      <w:proofErr w:type="gramStart"/>
+      <w:r>
+        <w:rPr>
+          <w:rFonts w:eastAsia="Gungsuh"/>
+        </w:rPr>
+        <w:t>AND  uniform</w:t>
+      </w:r>
+      <w:proofErr w:type="gramEnd"/>
+      <w:r>
+        <w:rPr>
+          <w:rFonts w:eastAsia="Gungsuh"/>
+        </w:rPr>
+        <w:t>(0, 1) &lt; 0.70</w:t>
       </w:r>
     </w:p>
     <w:p>
@@ -2128,8 +2513,53 @@
       <w:r>
         <w:t xml:space="preserve">Rule 2: </w:t>
       </w:r>
-      <w:r>
-        <w:t>lrp = 1  if lrp = 0  AND  exactly 1 immediate neighbour has lrp = 1 AND  uniform(0, 1) &lt; 0.15</w:t>
+      <w:proofErr w:type="spellStart"/>
+      <w:r>
+        <w:t>lrp</w:t>
+      </w:r>
+      <w:proofErr w:type="spellEnd"/>
+      <w:r>
+        <w:t xml:space="preserve"> = </w:t>
+      </w:r>
+      <w:proofErr w:type="gramStart"/>
+      <w:r>
+        <w:t>1  if</w:t>
+      </w:r>
+      <w:proofErr w:type="gramEnd"/>
+      <w:r>
+        <w:t xml:space="preserve"> </w:t>
+      </w:r>
+      <w:proofErr w:type="spellStart"/>
+      <w:r>
+        <w:t>lrp</w:t>
+      </w:r>
+      <w:proofErr w:type="spellEnd"/>
+      <w:r>
+        <w:t xml:space="preserve"> = </w:t>
+      </w:r>
+      <w:proofErr w:type="gramStart"/>
+      <w:r>
+        <w:t>0  AND</w:t>
+      </w:r>
+      <w:proofErr w:type="gramEnd"/>
+      <w:r>
+        <w:t xml:space="preserve">  exactly 1 immediate neighbour has </w:t>
+      </w:r>
+      <w:proofErr w:type="spellStart"/>
+      <w:r>
+        <w:t>lrp</w:t>
+      </w:r>
+      <w:proofErr w:type="spellEnd"/>
+      <w:r>
+        <w:t xml:space="preserve"> = 1 </w:t>
+      </w:r>
+      <w:proofErr w:type="gramStart"/>
+      <w:r>
+        <w:t>AND  uniform</w:t>
+      </w:r>
+      <w:proofErr w:type="gramEnd"/>
+      <w:r>
+        <w:t>(0, 1) &lt; 0.15</w:t>
       </w:r>
     </w:p>
     <w:p>
@@ -2142,8 +2572,45 @@
       <w:r>
         <w:t xml:space="preserve">Rule 3: </w:t>
       </w:r>
-      <w:r>
-        <w:t>lrp = 1  if lrp = 0  AND  normal(0.4, 0.3) &gt; 1.0</w:t>
+      <w:proofErr w:type="spellStart"/>
+      <w:r>
+        <w:t>lrp</w:t>
+      </w:r>
+      <w:proofErr w:type="spellEnd"/>
+      <w:r>
+        <w:t xml:space="preserve"> = </w:t>
+      </w:r>
+      <w:proofErr w:type="gramStart"/>
+      <w:r>
+        <w:t>1  if</w:t>
+      </w:r>
+      <w:proofErr w:type="gramEnd"/>
+      <w:r>
+        <w:t xml:space="preserve"> </w:t>
+      </w:r>
+      <w:proofErr w:type="spellStart"/>
+      <w:r>
+        <w:t>lrp</w:t>
+      </w:r>
+      <w:proofErr w:type="spellEnd"/>
+      <w:r>
+        <w:t xml:space="preserve"> = </w:t>
+      </w:r>
+      <w:proofErr w:type="gramStart"/>
+      <w:r>
+        <w:t>0  AND</w:t>
+      </w:r>
+      <w:proofErr w:type="gramEnd"/>
+      <w:r>
+        <w:t xml:space="preserve">  </w:t>
+      </w:r>
+      <w:proofErr w:type="gramStart"/>
+      <w:r>
+        <w:t>normal(</w:t>
+      </w:r>
+      <w:proofErr w:type="gramEnd"/>
+      <w:r>
+        <w:t>0.4, 0.3) &gt; 1.0</w:t>
       </w:r>
     </w:p>
     <w:p>
@@ -2157,9 +2624,11 @@
       <w:r>
         <w:t xml:space="preserve">Rule 4: </w:t>
       </w:r>
+      <w:proofErr w:type="spellStart"/>
       <w:r>
         <w:t>lrp</w:t>
       </w:r>
+      <w:proofErr w:type="spellEnd"/>
       <w:r>
         <w:t xml:space="preserve"> = 0 if TRUE</w:t>
       </w:r>
@@ -2204,8 +2673,18 @@
       <w:r>
         <w:t xml:space="preserve">X = Y = S = </w:t>
       </w:r>
-      <w:r>
-        <w:t xml:space="preserve">{ lrp </w:t>
+      <w:proofErr w:type="gramStart"/>
+      <w:r>
+        <w:t xml:space="preserve">{ </w:t>
+      </w:r>
+      <w:proofErr w:type="spellStart"/>
+      <w:r>
+        <w:t>lrp</w:t>
+      </w:r>
+      <w:proofErr w:type="spellEnd"/>
+      <w:proofErr w:type="gramEnd"/>
+      <w:r>
+        <w:t xml:space="preserve"> </w:t>
       </w:r>
       <w:r>
         <w:rPr>
@@ -2214,7 +2693,15 @@
         <w:t>∈</w:t>
       </w:r>
       <w:r>
-        <w:t xml:space="preserve"> {0,1}, hrp </w:t>
+        <w:t xml:space="preserve"> {0,1}, </w:t>
+      </w:r>
+      <w:proofErr w:type="spellStart"/>
+      <w:r>
+        <w:t>hrp</w:t>
+      </w:r>
+      <w:proofErr w:type="spellEnd"/>
+      <w:r>
+        <w:t xml:space="preserve"> </w:t>
       </w:r>
       <w:r>
         <w:rPr>
@@ -2223,8 +2710,13 @@
         <w:t>∈</w:t>
       </w:r>
       <w:r>
-        <w:t xml:space="preserve"> {0,2} }</w:t>
-      </w:r>
+        <w:t xml:space="preserve"> {0,2</w:t>
+      </w:r>
+      <w:proofErr w:type="gramStart"/>
+      <w:r>
+        <w:t>} }</w:t>
+      </w:r>
+      <w:proofErr w:type="gramEnd"/>
     </w:p>
     <w:p>
       <w:pPr>
@@ -2255,7 +2747,23 @@
         <w:spacing w:before="240" w:after="240"/>
       </w:pPr>
       <w:r>
-        <w:t>I = &lt; η, μ, Px, Py &gt; with η = 8, μ = 0, Px = {Ø}, Py = {Ø}</w:t>
+        <w:t xml:space="preserve">I = &lt; η, μ, </w:t>
+      </w:r>
+      <w:proofErr w:type="spellStart"/>
+      <w:r>
+        <w:t>Px</w:t>
+      </w:r>
+      <w:proofErr w:type="spellEnd"/>
+      <w:r>
+        <w:t xml:space="preserve">, Py &gt; with η = 8, μ = 0, </w:t>
+      </w:r>
+      <w:proofErr w:type="spellStart"/>
+      <w:r>
+        <w:t>Px</w:t>
+      </w:r>
+      <w:proofErr w:type="spellEnd"/>
+      <w:r>
+        <w:t xml:space="preserve"> = {Ø}, Py = {Ø}</w:t>
       </w:r>
     </w:p>
     <w:p>
@@ -2280,12 +2788,56 @@
         </w:rPr>
         <w:t xml:space="preserve">N = </w:t>
       </w:r>
-      <w:r>
-        <w:rPr>
-          <w:rFonts w:eastAsia="Gungsuh"/>
-        </w:rPr>
-        <w:t>{ (−2,0), (−1,0), (1,0), (2,0), (0,−2), (0,−1), (0,1), (0,2) }</w:t>
-      </w:r>
+      <w:proofErr w:type="gramStart"/>
+      <w:r>
+        <w:rPr>
+          <w:rFonts w:eastAsia="Gungsuh"/>
+        </w:rPr>
+        <w:t>{ (</w:t>
+      </w:r>
+      <w:proofErr w:type="gramEnd"/>
+      <w:r>
+        <w:rPr>
+          <w:rFonts w:eastAsia="Gungsuh"/>
+        </w:rPr>
+        <w:t>−2,0), (−1,0), (1,0), (2,0), (</w:t>
+      </w:r>
+      <w:proofErr w:type="gramStart"/>
+      <w:r>
+        <w:rPr>
+          <w:rFonts w:eastAsia="Gungsuh"/>
+        </w:rPr>
+        <w:t>0,−</w:t>
+      </w:r>
+      <w:proofErr w:type="gramEnd"/>
+      <w:r>
+        <w:rPr>
+          <w:rFonts w:eastAsia="Gungsuh"/>
+        </w:rPr>
+        <w:t>2), (</w:t>
+      </w:r>
+      <w:proofErr w:type="gramStart"/>
+      <w:r>
+        <w:rPr>
+          <w:rFonts w:eastAsia="Gungsuh"/>
+        </w:rPr>
+        <w:t>0,−</w:t>
+      </w:r>
+      <w:proofErr w:type="gramEnd"/>
+      <w:r>
+        <w:rPr>
+          <w:rFonts w:eastAsia="Gungsuh"/>
+        </w:rPr>
+        <w:t>1), (0,1), (0,2</w:t>
+      </w:r>
+      <w:proofErr w:type="gramStart"/>
+      <w:r>
+        <w:rPr>
+          <w:rFonts w:eastAsia="Gungsuh"/>
+        </w:rPr>
+        <w:t>) }</w:t>
+      </w:r>
+      <w:proofErr w:type="gramEnd"/>
     </w:p>
     <w:p>
       <w:pPr>
@@ -2315,7 +2867,23 @@
         <w:spacing w:before="240" w:after="240"/>
       </w:pPr>
       <w:r>
-        <w:t>Component δint, δext, λ, D:</w:t>
+        <w:t xml:space="preserve">Component </w:t>
+      </w:r>
+      <w:proofErr w:type="spellStart"/>
+      <w:r>
+        <w:t>δint</w:t>
+      </w:r>
+      <w:proofErr w:type="spellEnd"/>
+      <w:r>
+        <w:t xml:space="preserve">, </w:t>
+      </w:r>
+      <w:proofErr w:type="spellStart"/>
+      <w:r>
+        <w:t>δext</w:t>
+      </w:r>
+      <w:proofErr w:type="spellEnd"/>
+      <w:r>
+        <w:t>, λ, D:</w:t>
       </w:r>
     </w:p>
     <w:p>
@@ -2377,11 +2945,89 @@
         </w:rPr>
         <w:t xml:space="preserve">Rule 1: </w:t>
       </w:r>
-      <w:r>
-        <w:rPr>
-          <w:rFonts w:eastAsia="Gungsuh"/>
-        </w:rPr>
-        <w:t>lrp = 1  if lrp = 0  AND  2+ immediate neighbours have lrp = 1 AND  uniform(0, 1) &lt; 0.70</w:t>
+      <w:proofErr w:type="spellStart"/>
+      <w:r>
+        <w:rPr>
+          <w:rFonts w:eastAsia="Gungsuh"/>
+        </w:rPr>
+        <w:t>lrp</w:t>
+      </w:r>
+      <w:proofErr w:type="spellEnd"/>
+      <w:r>
+        <w:rPr>
+          <w:rFonts w:eastAsia="Gungsuh"/>
+        </w:rPr>
+        <w:t xml:space="preserve"> = </w:t>
+      </w:r>
+      <w:proofErr w:type="gramStart"/>
+      <w:r>
+        <w:rPr>
+          <w:rFonts w:eastAsia="Gungsuh"/>
+        </w:rPr>
+        <w:t>1  if</w:t>
+      </w:r>
+      <w:proofErr w:type="gramEnd"/>
+      <w:r>
+        <w:rPr>
+          <w:rFonts w:eastAsia="Gungsuh"/>
+        </w:rPr>
+        <w:t xml:space="preserve"> </w:t>
+      </w:r>
+      <w:proofErr w:type="spellStart"/>
+      <w:r>
+        <w:rPr>
+          <w:rFonts w:eastAsia="Gungsuh"/>
+        </w:rPr>
+        <w:t>lrp</w:t>
+      </w:r>
+      <w:proofErr w:type="spellEnd"/>
+      <w:r>
+        <w:rPr>
+          <w:rFonts w:eastAsia="Gungsuh"/>
+        </w:rPr>
+        <w:t xml:space="preserve"> = </w:t>
+      </w:r>
+      <w:proofErr w:type="gramStart"/>
+      <w:r>
+        <w:rPr>
+          <w:rFonts w:eastAsia="Gungsuh"/>
+        </w:rPr>
+        <w:t>0  AND</w:t>
+      </w:r>
+      <w:proofErr w:type="gramEnd"/>
+      <w:r>
+        <w:rPr>
+          <w:rFonts w:eastAsia="Gungsuh"/>
+        </w:rPr>
+        <w:t xml:space="preserve">  2+ immediate neighbours have </w:t>
+      </w:r>
+      <w:proofErr w:type="spellStart"/>
+      <w:r>
+        <w:rPr>
+          <w:rFonts w:eastAsia="Gungsuh"/>
+        </w:rPr>
+        <w:t>lrp</w:t>
+      </w:r>
+      <w:proofErr w:type="spellEnd"/>
+      <w:r>
+        <w:rPr>
+          <w:rFonts w:eastAsia="Gungsuh"/>
+        </w:rPr>
+        <w:t xml:space="preserve"> = 1 </w:t>
+      </w:r>
+      <w:proofErr w:type="gramStart"/>
+      <w:r>
+        <w:rPr>
+          <w:rFonts w:eastAsia="Gungsuh"/>
+        </w:rPr>
+        <w:t>AND  uniform</w:t>
+      </w:r>
+      <w:proofErr w:type="gramEnd"/>
+      <w:r>
+        <w:rPr>
+          <w:rFonts w:eastAsia="Gungsuh"/>
+        </w:rPr>
+        <w:t>(0, 1) &lt; 0.70</w:t>
       </w:r>
     </w:p>
     <w:p>
@@ -2402,11 +3048,89 @@
         </w:rPr>
         <w:t xml:space="preserve">Rule 2: </w:t>
       </w:r>
-      <w:r>
-        <w:rPr>
-          <w:rFonts w:eastAsia="Gungsuh"/>
-        </w:rPr>
-        <w:t>lrp = 1  if lrp = 0  AND  exactly 1 immediate neighbour has lrp = 1 AND  uniform(0, 1) &lt; 0.15</w:t>
+      <w:proofErr w:type="spellStart"/>
+      <w:r>
+        <w:rPr>
+          <w:rFonts w:eastAsia="Gungsuh"/>
+        </w:rPr>
+        <w:t>lrp</w:t>
+      </w:r>
+      <w:proofErr w:type="spellEnd"/>
+      <w:r>
+        <w:rPr>
+          <w:rFonts w:eastAsia="Gungsuh"/>
+        </w:rPr>
+        <w:t xml:space="preserve"> = </w:t>
+      </w:r>
+      <w:proofErr w:type="gramStart"/>
+      <w:r>
+        <w:rPr>
+          <w:rFonts w:eastAsia="Gungsuh"/>
+        </w:rPr>
+        <w:t>1  if</w:t>
+      </w:r>
+      <w:proofErr w:type="gramEnd"/>
+      <w:r>
+        <w:rPr>
+          <w:rFonts w:eastAsia="Gungsuh"/>
+        </w:rPr>
+        <w:t xml:space="preserve"> </w:t>
+      </w:r>
+      <w:proofErr w:type="spellStart"/>
+      <w:r>
+        <w:rPr>
+          <w:rFonts w:eastAsia="Gungsuh"/>
+        </w:rPr>
+        <w:t>lrp</w:t>
+      </w:r>
+      <w:proofErr w:type="spellEnd"/>
+      <w:r>
+        <w:rPr>
+          <w:rFonts w:eastAsia="Gungsuh"/>
+        </w:rPr>
+        <w:t xml:space="preserve"> = </w:t>
+      </w:r>
+      <w:proofErr w:type="gramStart"/>
+      <w:r>
+        <w:rPr>
+          <w:rFonts w:eastAsia="Gungsuh"/>
+        </w:rPr>
+        <w:t>0  AND</w:t>
+      </w:r>
+      <w:proofErr w:type="gramEnd"/>
+      <w:r>
+        <w:rPr>
+          <w:rFonts w:eastAsia="Gungsuh"/>
+        </w:rPr>
+        <w:t xml:space="preserve">  exactly 1 immediate neighbour has </w:t>
+      </w:r>
+      <w:proofErr w:type="spellStart"/>
+      <w:r>
+        <w:rPr>
+          <w:rFonts w:eastAsia="Gungsuh"/>
+        </w:rPr>
+        <w:t>lrp</w:t>
+      </w:r>
+      <w:proofErr w:type="spellEnd"/>
+      <w:r>
+        <w:rPr>
+          <w:rFonts w:eastAsia="Gungsuh"/>
+        </w:rPr>
+        <w:t xml:space="preserve"> = 1 </w:t>
+      </w:r>
+      <w:proofErr w:type="gramStart"/>
+      <w:r>
+        <w:rPr>
+          <w:rFonts w:eastAsia="Gungsuh"/>
+        </w:rPr>
+        <w:t>AND  uniform</w:t>
+      </w:r>
+      <w:proofErr w:type="gramEnd"/>
+      <w:r>
+        <w:rPr>
+          <w:rFonts w:eastAsia="Gungsuh"/>
+        </w:rPr>
+        <w:t>(0, 1) &lt; 0.15</w:t>
       </w:r>
     </w:p>
     <w:p>
@@ -2424,11 +3148,75 @@
         </w:rPr>
         <w:t xml:space="preserve">Rule 3: </w:t>
       </w:r>
-      <w:r>
-        <w:rPr>
-          <w:rFonts w:eastAsia="Gungsuh"/>
-        </w:rPr>
-        <w:t>lrp = 1  if lrp = 0  AND  normal(0.4, 0.3) &gt; 1.0</w:t>
+      <w:proofErr w:type="spellStart"/>
+      <w:r>
+        <w:rPr>
+          <w:rFonts w:eastAsia="Gungsuh"/>
+        </w:rPr>
+        <w:t>lrp</w:t>
+      </w:r>
+      <w:proofErr w:type="spellEnd"/>
+      <w:r>
+        <w:rPr>
+          <w:rFonts w:eastAsia="Gungsuh"/>
+        </w:rPr>
+        <w:t xml:space="preserve"> = </w:t>
+      </w:r>
+      <w:proofErr w:type="gramStart"/>
+      <w:r>
+        <w:rPr>
+          <w:rFonts w:eastAsia="Gungsuh"/>
+        </w:rPr>
+        <w:t>1  if</w:t>
+      </w:r>
+      <w:proofErr w:type="gramEnd"/>
+      <w:r>
+        <w:rPr>
+          <w:rFonts w:eastAsia="Gungsuh"/>
+        </w:rPr>
+        <w:t xml:space="preserve"> </w:t>
+      </w:r>
+      <w:proofErr w:type="spellStart"/>
+      <w:r>
+        <w:rPr>
+          <w:rFonts w:eastAsia="Gungsuh"/>
+        </w:rPr>
+        <w:t>lrp</w:t>
+      </w:r>
+      <w:proofErr w:type="spellEnd"/>
+      <w:r>
+        <w:rPr>
+          <w:rFonts w:eastAsia="Gungsuh"/>
+        </w:rPr>
+        <w:t xml:space="preserve"> = </w:t>
+      </w:r>
+      <w:proofErr w:type="gramStart"/>
+      <w:r>
+        <w:rPr>
+          <w:rFonts w:eastAsia="Gungsuh"/>
+        </w:rPr>
+        <w:t>0  AND</w:t>
+      </w:r>
+      <w:proofErr w:type="gramEnd"/>
+      <w:r>
+        <w:rPr>
+          <w:rFonts w:eastAsia="Gungsuh"/>
+        </w:rPr>
+        <w:t xml:space="preserve">  </w:t>
+      </w:r>
+      <w:proofErr w:type="gramStart"/>
+      <w:r>
+        <w:rPr>
+          <w:rFonts w:eastAsia="Gungsuh"/>
+        </w:rPr>
+        <w:t>normal(</w:t>
+      </w:r>
+      <w:proofErr w:type="gramEnd"/>
+      <w:r>
+        <w:rPr>
+          <w:rFonts w:eastAsia="Gungsuh"/>
+        </w:rPr>
+        <w:t>0.4, 0.3) &gt; 1.0</w:t>
       </w:r>
     </w:p>
     <w:p>
@@ -2443,9 +3231,11 @@
       <w:r>
         <w:t xml:space="preserve">Rule 4: </w:t>
       </w:r>
+      <w:proofErr w:type="spellStart"/>
       <w:r>
         <w:t>lrp</w:t>
       </w:r>
+      <w:proofErr w:type="spellEnd"/>
       <w:r>
         <w:t xml:space="preserve"> = 0 if TRUE</w:t>
       </w:r>
@@ -2475,11 +3265,89 @@
         </w:rPr>
         <w:t xml:space="preserve">Rule 1: </w:t>
       </w:r>
-      <w:r>
-        <w:rPr>
-          <w:rFonts w:eastAsia="Gungsuh"/>
-        </w:rPr>
-        <w:t>hrp = 2  if hrp = 0  AND  lrp = 1 AND  2+ immediate neighbours have lrp = 1</w:t>
+      <w:proofErr w:type="spellStart"/>
+      <w:r>
+        <w:rPr>
+          <w:rFonts w:eastAsia="Gungsuh"/>
+        </w:rPr>
+        <w:t>hrp</w:t>
+      </w:r>
+      <w:proofErr w:type="spellEnd"/>
+      <w:r>
+        <w:rPr>
+          <w:rFonts w:eastAsia="Gungsuh"/>
+        </w:rPr>
+        <w:t xml:space="preserve"> = </w:t>
+      </w:r>
+      <w:proofErr w:type="gramStart"/>
+      <w:r>
+        <w:rPr>
+          <w:rFonts w:eastAsia="Gungsuh"/>
+        </w:rPr>
+        <w:t>2  if</w:t>
+      </w:r>
+      <w:proofErr w:type="gramEnd"/>
+      <w:r>
+        <w:rPr>
+          <w:rFonts w:eastAsia="Gungsuh"/>
+        </w:rPr>
+        <w:t xml:space="preserve"> </w:t>
+      </w:r>
+      <w:proofErr w:type="spellStart"/>
+      <w:r>
+        <w:rPr>
+          <w:rFonts w:eastAsia="Gungsuh"/>
+        </w:rPr>
+        <w:t>hrp</w:t>
+      </w:r>
+      <w:proofErr w:type="spellEnd"/>
+      <w:r>
+        <w:rPr>
+          <w:rFonts w:eastAsia="Gungsuh"/>
+        </w:rPr>
+        <w:t xml:space="preserve"> = </w:t>
+      </w:r>
+      <w:proofErr w:type="gramStart"/>
+      <w:r>
+        <w:rPr>
+          <w:rFonts w:eastAsia="Gungsuh"/>
+        </w:rPr>
+        <w:t>0  AND</w:t>
+      </w:r>
+      <w:proofErr w:type="gramEnd"/>
+      <w:r>
+        <w:rPr>
+          <w:rFonts w:eastAsia="Gungsuh"/>
+        </w:rPr>
+        <w:t xml:space="preserve">  </w:t>
+      </w:r>
+      <w:proofErr w:type="spellStart"/>
+      <w:r>
+        <w:rPr>
+          <w:rFonts w:eastAsia="Gungsuh"/>
+        </w:rPr>
+        <w:t>lrp</w:t>
+      </w:r>
+      <w:proofErr w:type="spellEnd"/>
+      <w:r>
+        <w:rPr>
+          <w:rFonts w:eastAsia="Gungsuh"/>
+        </w:rPr>
+        <w:t xml:space="preserve"> = 1 AND  2+ immediate neighbours have </w:t>
+      </w:r>
+      <w:proofErr w:type="spellStart"/>
+      <w:r>
+        <w:rPr>
+          <w:rFonts w:eastAsia="Gungsuh"/>
+        </w:rPr>
+        <w:t>lrp</w:t>
+      </w:r>
+      <w:proofErr w:type="spellEnd"/>
+      <w:r>
+        <w:rPr>
+          <w:rFonts w:eastAsia="Gungsuh"/>
+        </w:rPr>
+        <w:t xml:space="preserve"> = 1</w:t>
       </w:r>
     </w:p>
     <w:p>
@@ -2499,9 +3367,11 @@
       <w:r>
         <w:t xml:space="preserve">: </w:t>
       </w:r>
+      <w:proofErr w:type="spellStart"/>
       <w:r>
         <w:t>hrp</w:t>
       </w:r>
+      <w:proofErr w:type="spellEnd"/>
       <w:r>
         <w:t xml:space="preserve"> = 0 if TRUE</w:t>
       </w:r>
@@ -2545,8 +3415,18 @@
       <w:r>
         <w:t xml:space="preserve">X = Y = S = </w:t>
       </w:r>
-      <w:r>
-        <w:t xml:space="preserve">{ lrp </w:t>
+      <w:proofErr w:type="gramStart"/>
+      <w:r>
+        <w:t xml:space="preserve">{ </w:t>
+      </w:r>
+      <w:proofErr w:type="spellStart"/>
+      <w:r>
+        <w:t>lrp</w:t>
+      </w:r>
+      <w:proofErr w:type="spellEnd"/>
+      <w:proofErr w:type="gramEnd"/>
+      <w:r>
+        <w:t xml:space="preserve"> </w:t>
       </w:r>
       <w:r>
         <w:rPr>
@@ -2555,7 +3435,15 @@
         <w:t>∈</w:t>
       </w:r>
       <w:r>
-        <w:t xml:space="preserve"> {0,1}, hrp </w:t>
+        <w:t xml:space="preserve"> {0,1}, </w:t>
+      </w:r>
+      <w:proofErr w:type="spellStart"/>
+      <w:r>
+        <w:t>hrp</w:t>
+      </w:r>
+      <w:proofErr w:type="spellEnd"/>
+      <w:r>
+        <w:t xml:space="preserve"> </w:t>
       </w:r>
       <w:r>
         <w:rPr>
@@ -2573,7 +3461,15 @@
         <w:t>∈</w:t>
       </w:r>
       <w:r>
-        <w:t xml:space="preserve"> {0,3}, incap </w:t>
+        <w:t xml:space="preserve"> {0,3}, </w:t>
+      </w:r>
+      <w:proofErr w:type="spellStart"/>
+      <w:r>
+        <w:t>incap</w:t>
+      </w:r>
+      <w:proofErr w:type="spellEnd"/>
+      <w:r>
+        <w:t xml:space="preserve"> </w:t>
       </w:r>
       <w:r>
         <w:rPr>
@@ -2582,8 +3478,13 @@
         <w:t>∈</w:t>
       </w:r>
       <w:r>
-        <w:t xml:space="preserve"> {0,4} }</w:t>
-      </w:r>
+        <w:t xml:space="preserve"> {0,4</w:t>
+      </w:r>
+      <w:proofErr w:type="gramStart"/>
+      <w:r>
+        <w:t>} }</w:t>
+      </w:r>
+      <w:proofErr w:type="gramEnd"/>
     </w:p>
     <w:p>
       <w:pPr>
@@ -2614,13 +3515,29 @@
         <w:spacing w:before="240" w:after="240"/>
       </w:pPr>
       <w:r>
-        <w:t xml:space="preserve">I = &lt; η, μ, Px, Py &gt; with η = </w:t>
+        <w:t xml:space="preserve">I = &lt; η, μ, </w:t>
+      </w:r>
+      <w:proofErr w:type="spellStart"/>
+      <w:r>
+        <w:t>Px</w:t>
+      </w:r>
+      <w:proofErr w:type="spellEnd"/>
+      <w:r>
+        <w:t xml:space="preserve">, Py &gt; with η = </w:t>
       </w:r>
       <w:r>
         <w:t>8</w:t>
       </w:r>
       <w:r>
-        <w:t>, μ = 0, Px = {Ø}, Py = {Ø}</w:t>
+        <w:t xml:space="preserve">, μ = 0, </w:t>
+      </w:r>
+      <w:proofErr w:type="spellStart"/>
+      <w:r>
+        <w:t>Px</w:t>
+      </w:r>
+      <w:proofErr w:type="spellEnd"/>
+      <w:r>
+        <w:t xml:space="preserve"> = {Ø}, Py = {Ø}</w:t>
       </w:r>
     </w:p>
     <w:p>
@@ -2643,14 +3560,64 @@
         <w:rPr>
           <w:rFonts w:eastAsia="Gungsuh"/>
         </w:rPr>
-        <w:t>N = {</w:t>
-      </w:r>
-      <w:r>
-        <w:rPr>
-          <w:rFonts w:eastAsia="Gungsuh"/>
-        </w:rPr>
-        <w:t xml:space="preserve"> (−2,0), (−1,0), (1,0), (2,0), (0,−2), (0,−1), (0,1), (0,2) }</w:t>
-      </w:r>
+        <w:t xml:space="preserve">N = </w:t>
+      </w:r>
+      <w:proofErr w:type="gramStart"/>
+      <w:r>
+        <w:rPr>
+          <w:rFonts w:eastAsia="Gungsuh"/>
+        </w:rPr>
+        <w:t>{</w:t>
+      </w:r>
+      <w:r>
+        <w:rPr>
+          <w:rFonts w:eastAsia="Gungsuh"/>
+        </w:rPr>
+        <w:t xml:space="preserve"> (</w:t>
+      </w:r>
+      <w:proofErr w:type="gramEnd"/>
+      <w:r>
+        <w:rPr>
+          <w:rFonts w:eastAsia="Gungsuh"/>
+        </w:rPr>
+        <w:t>−2,0), (−1,0), (1,0), (2,0), (</w:t>
+      </w:r>
+      <w:proofErr w:type="gramStart"/>
+      <w:r>
+        <w:rPr>
+          <w:rFonts w:eastAsia="Gungsuh"/>
+        </w:rPr>
+        <w:t>0,−</w:t>
+      </w:r>
+      <w:proofErr w:type="gramEnd"/>
+      <w:r>
+        <w:rPr>
+          <w:rFonts w:eastAsia="Gungsuh"/>
+        </w:rPr>
+        <w:t>2), (</w:t>
+      </w:r>
+      <w:proofErr w:type="gramStart"/>
+      <w:r>
+        <w:rPr>
+          <w:rFonts w:eastAsia="Gungsuh"/>
+        </w:rPr>
+        <w:t>0,−</w:t>
+      </w:r>
+      <w:proofErr w:type="gramEnd"/>
+      <w:r>
+        <w:rPr>
+          <w:rFonts w:eastAsia="Gungsuh"/>
+        </w:rPr>
+        <w:t>1), (0,1), (0,2</w:t>
+      </w:r>
+      <w:proofErr w:type="gramStart"/>
+      <w:r>
+        <w:rPr>
+          <w:rFonts w:eastAsia="Gungsuh"/>
+        </w:rPr>
+        <w:t>) }</w:t>
+      </w:r>
+      <w:proofErr w:type="gramEnd"/>
     </w:p>
     <w:p>
       <w:pPr>
@@ -2680,7 +3647,23 @@
         <w:spacing w:before="240" w:after="240"/>
       </w:pPr>
       <w:r>
-        <w:t>Component δint, δext, λ, D:</w:t>
+        <w:t xml:space="preserve">Component </w:t>
+      </w:r>
+      <w:proofErr w:type="spellStart"/>
+      <w:r>
+        <w:t>δint</w:t>
+      </w:r>
+      <w:proofErr w:type="spellEnd"/>
+      <w:r>
+        <w:t xml:space="preserve">, </w:t>
+      </w:r>
+      <w:proofErr w:type="spellStart"/>
+      <w:r>
+        <w:t>δext</w:t>
+      </w:r>
+      <w:proofErr w:type="spellEnd"/>
+      <w:r>
+        <w:t>, λ, D:</w:t>
       </w:r>
     </w:p>
     <w:p>
@@ -2726,11 +3709,89 @@
         </w:rPr>
         <w:t xml:space="preserve">: </w:t>
       </w:r>
-      <w:r>
-        <w:rPr>
-          <w:rFonts w:eastAsia="Gungsuh"/>
-        </w:rPr>
-        <w:t>lrp = 1  if lrp = 0  AND  2+ immediate neighbours have lrp = 1 AND  uniform(0, 1) &lt; 0.70</w:t>
+      <w:proofErr w:type="spellStart"/>
+      <w:r>
+        <w:rPr>
+          <w:rFonts w:eastAsia="Gungsuh"/>
+        </w:rPr>
+        <w:t>lrp</w:t>
+      </w:r>
+      <w:proofErr w:type="spellEnd"/>
+      <w:r>
+        <w:rPr>
+          <w:rFonts w:eastAsia="Gungsuh"/>
+        </w:rPr>
+        <w:t xml:space="preserve"> = </w:t>
+      </w:r>
+      <w:proofErr w:type="gramStart"/>
+      <w:r>
+        <w:rPr>
+          <w:rFonts w:eastAsia="Gungsuh"/>
+        </w:rPr>
+        <w:t>1  if</w:t>
+      </w:r>
+      <w:proofErr w:type="gramEnd"/>
+      <w:r>
+        <w:rPr>
+          <w:rFonts w:eastAsia="Gungsuh"/>
+        </w:rPr>
+        <w:t xml:space="preserve"> </w:t>
+      </w:r>
+      <w:proofErr w:type="spellStart"/>
+      <w:r>
+        <w:rPr>
+          <w:rFonts w:eastAsia="Gungsuh"/>
+        </w:rPr>
+        <w:t>lrp</w:t>
+      </w:r>
+      <w:proofErr w:type="spellEnd"/>
+      <w:r>
+        <w:rPr>
+          <w:rFonts w:eastAsia="Gungsuh"/>
+        </w:rPr>
+        <w:t xml:space="preserve"> = </w:t>
+      </w:r>
+      <w:proofErr w:type="gramStart"/>
+      <w:r>
+        <w:rPr>
+          <w:rFonts w:eastAsia="Gungsuh"/>
+        </w:rPr>
+        <w:t>0  AND</w:t>
+      </w:r>
+      <w:proofErr w:type="gramEnd"/>
+      <w:r>
+        <w:rPr>
+          <w:rFonts w:eastAsia="Gungsuh"/>
+        </w:rPr>
+        <w:t xml:space="preserve">  2+ immediate neighbours have </w:t>
+      </w:r>
+      <w:proofErr w:type="spellStart"/>
+      <w:r>
+        <w:rPr>
+          <w:rFonts w:eastAsia="Gungsuh"/>
+        </w:rPr>
+        <w:t>lrp</w:t>
+      </w:r>
+      <w:proofErr w:type="spellEnd"/>
+      <w:r>
+        <w:rPr>
+          <w:rFonts w:eastAsia="Gungsuh"/>
+        </w:rPr>
+        <w:t xml:space="preserve"> = 1 </w:t>
+      </w:r>
+      <w:proofErr w:type="gramStart"/>
+      <w:r>
+        <w:rPr>
+          <w:rFonts w:eastAsia="Gungsuh"/>
+        </w:rPr>
+        <w:t>AND  uniform</w:t>
+      </w:r>
+      <w:proofErr w:type="gramEnd"/>
+      <w:r>
+        <w:rPr>
+          <w:rFonts w:eastAsia="Gungsuh"/>
+        </w:rPr>
+        <w:t>(0, 1) &lt; 0.70</w:t>
       </w:r>
     </w:p>
     <w:p>
@@ -2743,8 +3804,53 @@
       <w:r>
         <w:t xml:space="preserve">Rule 2: </w:t>
       </w:r>
-      <w:r>
-        <w:t>lrp = 1  if lrp = 0  AND  exactly 1 immediate neighbour has lrp = 1 AND  uniform(0, 1) &lt; 0.15</w:t>
+      <w:proofErr w:type="spellStart"/>
+      <w:r>
+        <w:t>lrp</w:t>
+      </w:r>
+      <w:proofErr w:type="spellEnd"/>
+      <w:r>
+        <w:t xml:space="preserve"> = </w:t>
+      </w:r>
+      <w:proofErr w:type="gramStart"/>
+      <w:r>
+        <w:t>1  if</w:t>
+      </w:r>
+      <w:proofErr w:type="gramEnd"/>
+      <w:r>
+        <w:t xml:space="preserve"> </w:t>
+      </w:r>
+      <w:proofErr w:type="spellStart"/>
+      <w:r>
+        <w:t>lrp</w:t>
+      </w:r>
+      <w:proofErr w:type="spellEnd"/>
+      <w:r>
+        <w:t xml:space="preserve"> = </w:t>
+      </w:r>
+      <w:proofErr w:type="gramStart"/>
+      <w:r>
+        <w:t>0  AND</w:t>
+      </w:r>
+      <w:proofErr w:type="gramEnd"/>
+      <w:r>
+        <w:t xml:space="preserve">  exactly 1 immediate neighbour has </w:t>
+      </w:r>
+      <w:proofErr w:type="spellStart"/>
+      <w:r>
+        <w:t>lrp</w:t>
+      </w:r>
+      <w:proofErr w:type="spellEnd"/>
+      <w:r>
+        <w:t xml:space="preserve"> = 1 </w:t>
+      </w:r>
+      <w:proofErr w:type="gramStart"/>
+      <w:r>
+        <w:t>AND  uniform</w:t>
+      </w:r>
+      <w:proofErr w:type="gramEnd"/>
+      <w:r>
+        <w:t>(0, 1) &lt; 0.15</w:t>
       </w:r>
     </w:p>
     <w:p>
@@ -2757,8 +3863,45 @@
       <w:r>
         <w:t xml:space="preserve">Rule 3: </w:t>
       </w:r>
-      <w:r>
-        <w:t>lrp = 1  if lrp = 0  AND  normal(0.4, 0.3) &gt; 1.0</w:t>
+      <w:proofErr w:type="spellStart"/>
+      <w:r>
+        <w:t>lrp</w:t>
+      </w:r>
+      <w:proofErr w:type="spellEnd"/>
+      <w:r>
+        <w:t xml:space="preserve"> = </w:t>
+      </w:r>
+      <w:proofErr w:type="gramStart"/>
+      <w:r>
+        <w:t>1  if</w:t>
+      </w:r>
+      <w:proofErr w:type="gramEnd"/>
+      <w:r>
+        <w:t xml:space="preserve"> </w:t>
+      </w:r>
+      <w:proofErr w:type="spellStart"/>
+      <w:r>
+        <w:t>lrp</w:t>
+      </w:r>
+      <w:proofErr w:type="spellEnd"/>
+      <w:r>
+        <w:t xml:space="preserve"> = </w:t>
+      </w:r>
+      <w:proofErr w:type="gramStart"/>
+      <w:r>
+        <w:t>0  AND</w:t>
+      </w:r>
+      <w:proofErr w:type="gramEnd"/>
+      <w:r>
+        <w:t xml:space="preserve">  </w:t>
+      </w:r>
+      <w:proofErr w:type="gramStart"/>
+      <w:r>
+        <w:t>normal(</w:t>
+      </w:r>
+      <w:proofErr w:type="gramEnd"/>
+      <w:r>
+        <w:t>0.4, 0.3) &gt; 1.0</w:t>
       </w:r>
     </w:p>
     <w:p>
@@ -2772,8 +3915,13 @@
       <w:r>
         <w:t xml:space="preserve">Rule 4: </w:t>
       </w:r>
-      <w:r>
-        <w:t xml:space="preserve">lrp </w:t>
+      <w:proofErr w:type="spellStart"/>
+      <w:r>
+        <w:t>lrp</w:t>
+      </w:r>
+      <w:proofErr w:type="spellEnd"/>
+      <w:r>
+        <w:t xml:space="preserve"> </w:t>
       </w:r>
       <w:r>
         <w:t>= 0 if TRUE</w:t>
@@ -2804,11 +3952,89 @@
         </w:rPr>
         <w:t xml:space="preserve">Rule 1: </w:t>
       </w:r>
-      <w:r>
-        <w:rPr>
-          <w:rFonts w:eastAsia="Gungsuh"/>
-        </w:rPr>
-        <w:t>hrp = 2  if hrp = 0  AND  lrp = 1 AND  2+ immediate neighbours have lrp = 1</w:t>
+      <w:proofErr w:type="spellStart"/>
+      <w:r>
+        <w:rPr>
+          <w:rFonts w:eastAsia="Gungsuh"/>
+        </w:rPr>
+        <w:t>hrp</w:t>
+      </w:r>
+      <w:proofErr w:type="spellEnd"/>
+      <w:r>
+        <w:rPr>
+          <w:rFonts w:eastAsia="Gungsuh"/>
+        </w:rPr>
+        <w:t xml:space="preserve"> = </w:t>
+      </w:r>
+      <w:proofErr w:type="gramStart"/>
+      <w:r>
+        <w:rPr>
+          <w:rFonts w:eastAsia="Gungsuh"/>
+        </w:rPr>
+        <w:t>2  if</w:t>
+      </w:r>
+      <w:proofErr w:type="gramEnd"/>
+      <w:r>
+        <w:rPr>
+          <w:rFonts w:eastAsia="Gungsuh"/>
+        </w:rPr>
+        <w:t xml:space="preserve"> </w:t>
+      </w:r>
+      <w:proofErr w:type="spellStart"/>
+      <w:r>
+        <w:rPr>
+          <w:rFonts w:eastAsia="Gungsuh"/>
+        </w:rPr>
+        <w:t>hrp</w:t>
+      </w:r>
+      <w:proofErr w:type="spellEnd"/>
+      <w:r>
+        <w:rPr>
+          <w:rFonts w:eastAsia="Gungsuh"/>
+        </w:rPr>
+        <w:t xml:space="preserve"> = </w:t>
+      </w:r>
+      <w:proofErr w:type="gramStart"/>
+      <w:r>
+        <w:rPr>
+          <w:rFonts w:eastAsia="Gungsuh"/>
+        </w:rPr>
+        <w:t>0  AND</w:t>
+      </w:r>
+      <w:proofErr w:type="gramEnd"/>
+      <w:r>
+        <w:rPr>
+          <w:rFonts w:eastAsia="Gungsuh"/>
+        </w:rPr>
+        <w:t xml:space="preserve">  </w:t>
+      </w:r>
+      <w:proofErr w:type="spellStart"/>
+      <w:r>
+        <w:rPr>
+          <w:rFonts w:eastAsia="Gungsuh"/>
+        </w:rPr>
+        <w:t>lrp</w:t>
+      </w:r>
+      <w:proofErr w:type="spellEnd"/>
+      <w:r>
+        <w:rPr>
+          <w:rFonts w:eastAsia="Gungsuh"/>
+        </w:rPr>
+        <w:t xml:space="preserve"> = 1 AND  2+ immediate neighbours have </w:t>
+      </w:r>
+      <w:proofErr w:type="spellStart"/>
+      <w:r>
+        <w:rPr>
+          <w:rFonts w:eastAsia="Gungsuh"/>
+        </w:rPr>
+        <w:t>lrp</w:t>
+      </w:r>
+      <w:proofErr w:type="spellEnd"/>
+      <w:r>
+        <w:rPr>
+          <w:rFonts w:eastAsia="Gungsuh"/>
+        </w:rPr>
+        <w:t xml:space="preserve"> = 1</w:t>
       </w:r>
     </w:p>
     <w:p>
@@ -2828,8 +4054,13 @@
       <w:r>
         <w:t xml:space="preserve">: </w:t>
       </w:r>
-      <w:r>
-        <w:t xml:space="preserve">hrp </w:t>
+      <w:proofErr w:type="spellStart"/>
+      <w:r>
+        <w:t>hrp</w:t>
+      </w:r>
+      <w:proofErr w:type="spellEnd"/>
+      <w:r>
+        <w:t xml:space="preserve"> </w:t>
       </w:r>
       <w:r>
         <w:t>= 0 if TRUE</w:t>
@@ -2858,7 +4089,47 @@
         <w:t xml:space="preserve">Rule 1: </w:t>
       </w:r>
       <w:r>
-        <w:t>crime = 3  if crime = 0  AND  hrp = 2   AND  any neighbour within range 2 has hrp = 2</w:t>
+        <w:t xml:space="preserve">crime = </w:t>
+      </w:r>
+      <w:proofErr w:type="gramStart"/>
+      <w:r>
+        <w:t>3  if</w:t>
+      </w:r>
+      <w:proofErr w:type="gramEnd"/>
+      <w:r>
+        <w:t xml:space="preserve"> crime = </w:t>
+      </w:r>
+      <w:proofErr w:type="gramStart"/>
+      <w:r>
+        <w:t>0  AND</w:t>
+      </w:r>
+      <w:proofErr w:type="gramEnd"/>
+      <w:r>
+        <w:t xml:space="preserve">  </w:t>
+      </w:r>
+      <w:proofErr w:type="spellStart"/>
+      <w:r>
+        <w:t>hrp</w:t>
+      </w:r>
+      <w:proofErr w:type="spellEnd"/>
+      <w:r>
+        <w:t xml:space="preserve"> = 2   </w:t>
+      </w:r>
+      <w:proofErr w:type="gramStart"/>
+      <w:r>
+        <w:t>AND  any</w:t>
+      </w:r>
+      <w:proofErr w:type="gramEnd"/>
+      <w:r>
+        <w:t xml:space="preserve"> neighbour within range 2 has </w:t>
+      </w:r>
+      <w:proofErr w:type="spellStart"/>
+      <w:r>
+        <w:t>hrp</w:t>
+      </w:r>
+      <w:proofErr w:type="spellEnd"/>
+      <w:r>
+        <w:t xml:space="preserve"> = 2</w:t>
       </w:r>
     </w:p>
     <w:p>
@@ -2905,8 +4176,16 @@
         <w:rPr>
           <w:lang w:val="fr-FR"/>
         </w:rPr>
-        <w:t xml:space="preserve"> —Incapacitation</w:t>
-      </w:r>
+        <w:t xml:space="preserve"> —</w:t>
+      </w:r>
+      <w:proofErr w:type="spellStart"/>
+      <w:r>
+        <w:rPr>
+          <w:lang w:val="fr-FR"/>
+        </w:rPr>
+        <w:t>Incapacitation</w:t>
+      </w:r>
+      <w:proofErr w:type="spellEnd"/>
       <w:r>
         <w:rPr>
           <w:lang w:val="fr-FR"/>
@@ -2928,11 +4207,103 @@
         </w:rPr>
         <w:t xml:space="preserve">Rule 1: </w:t>
       </w:r>
-      <w:r>
-        <w:rPr>
-          <w:rFonts w:eastAsia="Gungsuh"/>
-        </w:rPr>
-        <w:t>incap = 4  if incap = 0  AND  crime = 3  AND  hrp = 2   AND  normal(0.4, 0.3) &gt; 0.1</w:t>
+      <w:proofErr w:type="spellStart"/>
+      <w:r>
+        <w:rPr>
+          <w:rFonts w:eastAsia="Gungsuh"/>
+        </w:rPr>
+        <w:t>incap</w:t>
+      </w:r>
+      <w:proofErr w:type="spellEnd"/>
+      <w:r>
+        <w:rPr>
+          <w:rFonts w:eastAsia="Gungsuh"/>
+        </w:rPr>
+        <w:t xml:space="preserve"> = </w:t>
+      </w:r>
+      <w:proofErr w:type="gramStart"/>
+      <w:r>
+        <w:rPr>
+          <w:rFonts w:eastAsia="Gungsuh"/>
+        </w:rPr>
+        <w:t>4  if</w:t>
+      </w:r>
+      <w:proofErr w:type="gramEnd"/>
+      <w:r>
+        <w:rPr>
+          <w:rFonts w:eastAsia="Gungsuh"/>
+        </w:rPr>
+        <w:t xml:space="preserve"> </w:t>
+      </w:r>
+      <w:proofErr w:type="spellStart"/>
+      <w:r>
+        <w:rPr>
+          <w:rFonts w:eastAsia="Gungsuh"/>
+        </w:rPr>
+        <w:t>incap</w:t>
+      </w:r>
+      <w:proofErr w:type="spellEnd"/>
+      <w:r>
+        <w:rPr>
+          <w:rFonts w:eastAsia="Gungsuh"/>
+        </w:rPr>
+        <w:t xml:space="preserve"> = </w:t>
+      </w:r>
+      <w:proofErr w:type="gramStart"/>
+      <w:r>
+        <w:rPr>
+          <w:rFonts w:eastAsia="Gungsuh"/>
+        </w:rPr>
+        <w:t>0  AND</w:t>
+      </w:r>
+      <w:proofErr w:type="gramEnd"/>
+      <w:r>
+        <w:rPr>
+          <w:rFonts w:eastAsia="Gungsuh"/>
+        </w:rPr>
+        <w:t xml:space="preserve">  crime = </w:t>
+      </w:r>
+      <w:proofErr w:type="gramStart"/>
+      <w:r>
+        <w:rPr>
+          <w:rFonts w:eastAsia="Gungsuh"/>
+        </w:rPr>
+        <w:t>3  AND</w:t>
+      </w:r>
+      <w:proofErr w:type="gramEnd"/>
+      <w:r>
+        <w:rPr>
+          <w:rFonts w:eastAsia="Gungsuh"/>
+        </w:rPr>
+        <w:t xml:space="preserve">  </w:t>
+      </w:r>
+      <w:proofErr w:type="spellStart"/>
+      <w:r>
+        <w:rPr>
+          <w:rFonts w:eastAsia="Gungsuh"/>
+        </w:rPr>
+        <w:t>hrp</w:t>
+      </w:r>
+      <w:proofErr w:type="spellEnd"/>
+      <w:r>
+        <w:rPr>
+          <w:rFonts w:eastAsia="Gungsuh"/>
+        </w:rPr>
+        <w:t xml:space="preserve"> = 2   </w:t>
+      </w:r>
+      <w:proofErr w:type="gramStart"/>
+      <w:r>
+        <w:rPr>
+          <w:rFonts w:eastAsia="Gungsuh"/>
+        </w:rPr>
+        <w:t>AND  normal</w:t>
+      </w:r>
+      <w:proofErr w:type="gramEnd"/>
+      <w:r>
+        <w:rPr>
+          <w:rFonts w:eastAsia="Gungsuh"/>
+        </w:rPr>
+        <w:t>(0.4, 0.3) &gt; 0.1</w:t>
       </w:r>
     </w:p>
     <w:p>
@@ -2952,9 +4323,11 @@
       <w:r>
         <w:t xml:space="preserve">: </w:t>
       </w:r>
+      <w:proofErr w:type="spellStart"/>
       <w:r>
         <w:t>incap</w:t>
       </w:r>
+      <w:proofErr w:type="spellEnd"/>
       <w:r>
         <w:t xml:space="preserve"> = 0 if TRUE</w:t>
       </w:r>
@@ -3193,8 +4566,17 @@
                 <w:b/>
                 <w:bCs/>
               </w:rPr>
-              <w:t>Expected Behavior</w:t>
-            </w:r>
+              <w:t xml:space="preserve">Expected </w:t>
+            </w:r>
+            <w:proofErr w:type="spellStart"/>
+            <w:r>
+              <w:rPr>
+                <w:b/>
+                <w:bCs/>
+              </w:rPr>
+              <w:t>Behavior</w:t>
+            </w:r>
+            <w:proofErr w:type="spellEnd"/>
           </w:p>
         </w:tc>
       </w:tr>
@@ -3244,9 +4626,11 @@
             <w:pPr>
               <w:spacing w:line="360" w:lineRule="auto"/>
             </w:pPr>
+            <w:proofErr w:type="spellStart"/>
             <w:r>
               <w:t>DruggistBasicModel</w:t>
             </w:r>
+            <w:proofErr w:type="spellEnd"/>
           </w:p>
         </w:tc>
         <w:tc>
@@ -3371,9 +4755,11 @@
             <w:pPr>
               <w:spacing w:line="360" w:lineRule="auto"/>
             </w:pPr>
+            <w:proofErr w:type="spellStart"/>
             <w:r>
               <w:t>AddictionModel</w:t>
             </w:r>
+            <w:proofErr w:type="spellEnd"/>
           </w:p>
         </w:tc>
         <w:tc>
@@ -3498,9 +4884,11 @@
             <w:pPr>
               <w:spacing w:line="360" w:lineRule="auto"/>
             </w:pPr>
+            <w:proofErr w:type="spellStart"/>
             <w:r>
               <w:t>FinalCrimeDrugModel</w:t>
             </w:r>
+            <w:proofErr w:type="spellEnd"/>
           </w:p>
         </w:tc>
         <w:tc>
@@ -3549,8 +4937,13 @@
               <w:spacing w:line="360" w:lineRule="auto"/>
             </w:pPr>
             <w:r>
-              <w:t>All people start healthy;</w:t>
-            </w:r>
+              <w:t xml:space="preserve">All people start </w:t>
+            </w:r>
+            <w:proofErr w:type="gramStart"/>
+            <w:r>
+              <w:t>healthy;</w:t>
+            </w:r>
+            <w:proofErr w:type="gramEnd"/>
           </w:p>
           <w:p>
             <w:pPr>
@@ -3692,7 +5085,15 @@
         <w:t xml:space="preserve"> repository. </w:t>
       </w:r>
       <w:r>
-        <w:t xml:space="preserve">For this report, they were implemented as gifs into the document. Each model generated a csv log file, which along side the configuration file, was uploaded to the Cell-DEVS web viewer. </w:t>
+        <w:t xml:space="preserve">For this report, they were implemented as gifs into the document. Each model generated a csv log file, which </w:t>
+      </w:r>
+      <w:proofErr w:type="spellStart"/>
+      <w:r>
+        <w:t>along side</w:t>
+      </w:r>
+      <w:proofErr w:type="spellEnd"/>
+      <w:r>
+        <w:t xml:space="preserve"> the configuration file, was uploaded to the Cell-DEVS web viewer. </w:t>
       </w:r>
       <w:r>
         <w:t>Note the following values:</w:t>
@@ -3892,13 +5293,24 @@
           <w:bCs/>
         </w:rPr>
       </w:pPr>
+      <w:proofErr w:type="spellStart"/>
       <w:r>
         <w:rPr>
           <w:b/>
           <w:bCs/>
         </w:rPr>
-        <w:t>druggist_config.json</w:t>
-      </w:r>
+        <w:t>druggist_</w:t>
+      </w:r>
+      <w:proofErr w:type="gramStart"/>
+      <w:r>
+        <w:rPr>
+          <w:b/>
+          <w:bCs/>
+        </w:rPr>
+        <w:t>config.json</w:t>
+      </w:r>
+      <w:proofErr w:type="spellEnd"/>
+      <w:proofErr w:type="gramEnd"/>
     </w:p>
     <w:p>
       <w:r>
@@ -3985,13 +5397,24 @@
           <w:bCs/>
         </w:rPr>
       </w:pPr>
+      <w:proofErr w:type="spellStart"/>
       <w:r>
         <w:rPr>
           <w:b/>
           <w:bCs/>
         </w:rPr>
-        <w:t>addiction_config.json</w:t>
-      </w:r>
+        <w:t>addiction_</w:t>
+      </w:r>
+      <w:proofErr w:type="gramStart"/>
+      <w:r>
+        <w:rPr>
+          <w:b/>
+          <w:bCs/>
+        </w:rPr>
+        <w:t>config.json</w:t>
+      </w:r>
+      <w:proofErr w:type="spellEnd"/>
+      <w:proofErr w:type="gramEnd"/>
     </w:p>
     <w:p>
       <w:r>
@@ -4084,13 +5507,24 @@
           <w:bCs/>
         </w:rPr>
       </w:pPr>
+      <w:proofErr w:type="spellStart"/>
       <w:r>
         <w:rPr>
           <w:b/>
           <w:bCs/>
         </w:rPr>
-        <w:t>crimedrug_config.json</w:t>
-      </w:r>
+        <w:t>crimedrug_</w:t>
+      </w:r>
+      <w:proofErr w:type="gramStart"/>
+      <w:r>
+        <w:rPr>
+          <w:b/>
+          <w:bCs/>
+        </w:rPr>
+        <w:t>config.json</w:t>
+      </w:r>
+      <w:proofErr w:type="spellEnd"/>
+      <w:proofErr w:type="gramEnd"/>
     </w:p>
     <w:p>
       <w:r>

</xml_diff>